<commit_message>
Fix Jenkinsfile - remove accidental shell command
</commit_message>
<xml_diff>
--- a/CSE304_BYOD-1.docx
+++ b/CSE304_BYOD-1.docx
@@ -114,10 +114,6 @@
       <w:pPr>
         <w:spacing w:after="20"/>
         <w:ind w:left="360" w:hanging="220"/>
-        <w:rPr>
-          <w:sz w:val="21"/>
-          <w:szCs w:val="21"/>
-        </w:rPr>
       </w:pPr>
       <w:r>
         <w:drawing>
@@ -162,107 +158,18 @@
           </wp:inline>
         </w:drawing>
       </w:r>
-      <w:bookmarkStart w:id="0" w:name="_GoBack"/>
-      <w:bookmarkEnd w:id="0"/>
-    </w:p>
-    <w:p>
-      <w:pPr>
-        <w:spacing w:before="140" w:after="40"/>
-      </w:pPr>
-      <w:r>
-        <w:rPr>
-          <w:b/>
-          <w:bCs/>
-          <w:sz w:val="22"/>
-          <w:szCs w:val="22"/>
-        </w:rPr>
-        <w:t>Q2. Docker Image Build &amp; Push via Jenkins (20 Marks)</w:t>
-      </w:r>
-    </w:p>
-    <w:p>
-      <w:pPr>
-        <w:spacing w:after="80"/>
-      </w:pPr>
-      <w:r>
-        <w:rPr>
-          <w:sz w:val="21"/>
-          <w:szCs w:val="21"/>
-        </w:rPr>
-        <w:t>Write a Dockerfile for the given application, trigger your Jenkins pipeline to build the image, push it to the registry with a tag, and run the container.</w:t>
-      </w:r>
-    </w:p>
-    <w:p>
-      <w:pPr>
-        <w:spacing w:after="20"/>
-      </w:pPr>
-      <w:r>
-        <w:rPr>
-          <w:sz w:val="21"/>
-          <w:szCs w:val="21"/>
-        </w:rPr>
-        <w:t>Screenshots/files required:</w:t>
-      </w:r>
-    </w:p>
-    <w:p>
-      <w:pPr>
-        <w:spacing w:after="20"/>
-        <w:ind w:left="360" w:hanging="220"/>
-      </w:pPr>
-      <w:r>
-        <w:rPr>
-          <w:sz w:val="21"/>
-          <w:szCs w:val="21"/>
-        </w:rPr>
-        <w:t>• Dockerfile used for the application — 5 marks</w:t>
-      </w:r>
-    </w:p>
-    <w:p>
-      <w:pPr>
-        <w:spacing w:after="20"/>
-        <w:ind w:left="360" w:hanging="220"/>
-      </w:pPr>
-      <w:r>
-        <w:rPr>
-          <w:sz w:val="21"/>
-          <w:szCs w:val="21"/>
-        </w:rPr>
-        <w:t>• Jenkins console output showing the image built successfully — 6 marks</w:t>
-      </w:r>
-    </w:p>
-    <w:p>
-      <w:pPr>
-        <w:spacing w:after="20"/>
-        <w:ind w:left="360" w:hanging="220"/>
-      </w:pPr>
-      <w:r>
-        <w:rPr>
-          <w:sz w:val="21"/>
-          <w:szCs w:val="21"/>
-        </w:rPr>
-        <w:t>• Registry push confirmation showing the image tag — 5 marks</w:t>
-      </w:r>
-    </w:p>
-    <w:p>
-      <w:pPr>
-        <w:spacing w:after="20"/>
-        <w:ind w:left="360" w:hanging="220"/>
-      </w:pPr>
-      <w:r>
-        <w:rPr>
-          <w:sz w:val="21"/>
-          <w:szCs w:val="21"/>
-        </w:rPr>
-        <w:t>• Container run output / browser screenshot confirming the application is accessible — 4 marks</w:t>
-      </w:r>
-    </w:p>
-    <w:p/>
-    <w:p>
+    </w:p>
+    <w:p>
+      <w:pPr>
+        <w:spacing w:after="20"/>
+        <w:ind w:left="360" w:hanging="220"/>
+      </w:pPr>
       <w:r>
         <w:drawing>
           <wp:inline distT="0" distB="0" distL="114300" distR="114300">
-            <wp:extent cx="5266690" cy="3291840"/>
-            <wp:effectExtent l="0" t="0" r="3810" b="10160"/>
-            <wp:docPr id="3" name="Picture 3"/>
+            <wp:extent cx="5271770" cy="3430270"/>
+            <wp:effectExtent l="0" t="0" r="11430" b="11430"/>
+            <wp:docPr id="2" name="Picture 2"/>
             <wp:cNvGraphicFramePr>
               <a:graphicFrameLocks xmlns:a="http://schemas.openxmlformats.org/drawingml/2006/main" noChangeAspect="1"/>
             </wp:cNvGraphicFramePr>
@@ -270,7 +177,7 @@
               <a:graphicData uri="http://schemas.openxmlformats.org/drawingml/2006/picture">
                 <pic:pic xmlns:pic="http://schemas.openxmlformats.org/drawingml/2006/picture">
                   <pic:nvPicPr>
-                    <pic:cNvPr id="3" name="Picture 3"/>
+                    <pic:cNvPr id="2" name="Picture 2"/>
                     <pic:cNvPicPr>
                       <a:picLocks noChangeAspect="1"/>
                     </pic:cNvPicPr>
@@ -284,7 +191,7 @@
                   <pic:spPr>
                     <a:xfrm>
                       <a:off x="0" y="0"/>
-                      <a:ext cx="5266690" cy="3291840"/>
+                      <a:ext cx="5271770" cy="3430270"/>
                     </a:xfrm>
                     <a:prstGeom prst="rect">
                       <a:avLst/>
@@ -301,114 +208,23 @@
         </w:drawing>
       </w:r>
     </w:p>
-    <w:p/>
-    <w:p>
-      <w:pPr>
-        <w:spacing w:before="140" w:after="40"/>
-      </w:pPr>
-      <w:r>
-        <w:rPr>
-          <w:b/>
-          <w:bCs/>
-          <w:sz w:val="22"/>
-          <w:szCs w:val="22"/>
-        </w:rPr>
-        <w:t>Q3. Selenium WebDriver Script — Basic Functional Testing (30 Marks)</w:t>
-      </w:r>
-    </w:p>
-    <w:p>
-      <w:pPr>
-        <w:spacing w:after="80"/>
-      </w:pPr>
-      <w:r>
-        <w:rPr>
-          <w:sz w:val="21"/>
-          <w:szCs w:val="21"/>
-        </w:rPr>
-        <w:t>Write a Selenium script that opens a given website, verifies the page title, and performs one form interaction (e.g., entering a search term and submitting).</w:t>
-      </w:r>
-    </w:p>
-    <w:p>
-      <w:pPr>
-        <w:spacing w:after="20"/>
-      </w:pPr>
-      <w:r>
-        <w:rPr>
-          <w:sz w:val="21"/>
-          <w:szCs w:val="21"/>
-        </w:rPr>
-        <w:t>Screenshots/files required:</w:t>
-      </w:r>
-    </w:p>
-    <w:p>
-      <w:pPr>
-        <w:spacing w:after="20"/>
-        <w:ind w:left="360" w:hanging="220"/>
-      </w:pPr>
-      <w:r>
-        <w:rPr>
-          <w:sz w:val="21"/>
-          <w:szCs w:val="21"/>
-        </w:rPr>
-        <w:t>• Full script code — 6 marks</w:t>
-      </w:r>
-    </w:p>
-    <w:p>
-      <w:pPr>
-        <w:spacing w:after="20"/>
-        <w:ind w:left="360" w:hanging="220"/>
-      </w:pPr>
-      <w:r>
-        <w:rPr>
-          <w:sz w:val="21"/>
-          <w:szCs w:val="21"/>
-        </w:rPr>
-        <w:t>• Terminal/IDE output showing the script executed successfully — 6 marks</w:t>
-      </w:r>
-    </w:p>
-    <w:p>
-      <w:pPr>
-        <w:spacing w:after="20"/>
-        <w:ind w:left="360" w:hanging="220"/>
-      </w:pPr>
-      <w:r>
-        <w:rPr>
-          <w:sz w:val="21"/>
-          <w:szCs w:val="21"/>
-        </w:rPr>
-        <w:t>• Assertion/log confirming the page title or URL matches the expected value — 8 marks</w:t>
-      </w:r>
-    </w:p>
-    <w:p>
-      <w:pPr>
-        <w:spacing w:after="20"/>
-        <w:ind w:left="360" w:hanging="220"/>
-      </w:pPr>
-      <w:r>
-        <w:rPr>
-          <w:sz w:val="21"/>
-          <w:szCs w:val="21"/>
-        </w:rPr>
-        <w:t>• Browser screenshot showing the result of the form interaction (e.g., search results page) — 10 marks</w:t>
-      </w:r>
-    </w:p>
-    <w:p>
-      <w:pPr>
-        <w:rPr>
-          <w:rFonts w:hint="default"/>
-          <w:lang w:val="en-US"/>
-        </w:rPr>
-      </w:pPr>
-      <w:r>
-        <w:rPr>
-          <w:rFonts w:hint="default"/>
-          <w:lang w:val="en-US"/>
-        </w:rPr>
+    <w:p>
+      <w:pPr>
+        <w:spacing w:after="20"/>
+        <w:ind w:left="360" w:hanging="220"/>
+      </w:pPr>
+    </w:p>
+    <w:p>
+      <w:pPr>
+        <w:spacing w:after="20"/>
+        <w:ind w:left="360" w:hanging="220"/>
+      </w:pPr>
+      <w:r>
         <w:drawing>
           <wp:inline distT="0" distB="0" distL="114300" distR="114300">
-            <wp:extent cx="5266690" cy="3291840"/>
-            <wp:effectExtent l="0" t="0" r="3810" b="10160"/>
-            <wp:docPr id="5" name="Picture 5" descr="Screenshot 2026-09-11 113624"/>
+            <wp:extent cx="5269230" cy="3140710"/>
+            <wp:effectExtent l="0" t="0" r="1270" b="8890"/>
+            <wp:docPr id="11" name="Picture 5"/>
             <wp:cNvGraphicFramePr>
               <a:graphicFrameLocks xmlns:a="http://schemas.openxmlformats.org/drawingml/2006/main" noChangeAspect="1"/>
             </wp:cNvGraphicFramePr>
@@ -416,7 +232,7 @@
               <a:graphicData uri="http://schemas.openxmlformats.org/drawingml/2006/picture">
                 <pic:pic xmlns:pic="http://schemas.openxmlformats.org/drawingml/2006/picture">
                   <pic:nvPicPr>
-                    <pic:cNvPr id="5" name="Picture 5" descr="Screenshot 2026-09-11 113624"/>
+                    <pic:cNvPr id="11" name="Picture 5"/>
                     <pic:cNvPicPr>
                       <a:picLocks noChangeAspect="1"/>
                     </pic:cNvPicPr>
@@ -430,99 +246,7 @@
                   <pic:spPr>
                     <a:xfrm>
                       <a:off x="0" y="0"/>
-                      <a:ext cx="5266690" cy="3291840"/>
-                    </a:xfrm>
-                    <a:prstGeom prst="rect">
-                      <a:avLst/>
-                    </a:prstGeom>
-                  </pic:spPr>
-                </pic:pic>
-              </a:graphicData>
-            </a:graphic>
-          </wp:inline>
-        </w:drawing>
-      </w:r>
-    </w:p>
-    <w:p>
-      <w:pPr>
-        <w:rPr>
-          <w:rFonts w:hint="default"/>
-          <w:lang w:val="en-US"/>
-        </w:rPr>
-      </w:pPr>
-      <w:r>
-        <w:rPr>
-          <w:rFonts w:hint="default"/>
-          <w:lang w:val="en-US"/>
-        </w:rPr>
-        <w:drawing>
-          <wp:inline distT="0" distB="0" distL="114300" distR="114300">
-            <wp:extent cx="5266690" cy="3291840"/>
-            <wp:effectExtent l="0" t="0" r="3810" b="10160"/>
-            <wp:docPr id="6" name="Picture 6" descr="Screenshot 2026-09-11 113633"/>
-            <wp:cNvGraphicFramePr>
-              <a:graphicFrameLocks xmlns:a="http://schemas.openxmlformats.org/drawingml/2006/main" noChangeAspect="1"/>
-            </wp:cNvGraphicFramePr>
-            <a:graphic xmlns:a="http://schemas.openxmlformats.org/drawingml/2006/main">
-              <a:graphicData uri="http://schemas.openxmlformats.org/drawingml/2006/picture">
-                <pic:pic xmlns:pic="http://schemas.openxmlformats.org/drawingml/2006/picture">
-                  <pic:nvPicPr>
-                    <pic:cNvPr id="6" name="Picture 6" descr="Screenshot 2026-09-11 113633"/>
-                    <pic:cNvPicPr>
-                      <a:picLocks noChangeAspect="1"/>
-                    </pic:cNvPicPr>
-                  </pic:nvPicPr>
-                  <pic:blipFill>
-                    <a:blip r:embed="rId7"/>
-                    <a:stretch>
-                      <a:fillRect/>
-                    </a:stretch>
-                  </pic:blipFill>
-                  <pic:spPr>
-                    <a:xfrm>
-                      <a:off x="0" y="0"/>
-                      <a:ext cx="5266690" cy="3291840"/>
-                    </a:xfrm>
-                    <a:prstGeom prst="rect">
-                      <a:avLst/>
-                    </a:prstGeom>
-                  </pic:spPr>
-                </pic:pic>
-              </a:graphicData>
-            </a:graphic>
-          </wp:inline>
-        </w:drawing>
-      </w:r>
-    </w:p>
-    <w:p>
-      <w:r>
-        <w:drawing>
-          <wp:inline distT="0" distB="0" distL="114300" distR="114300">
-            <wp:extent cx="5273675" cy="3293745"/>
-            <wp:effectExtent l="0" t="0" r="9525" b="8255"/>
-            <wp:docPr id="4" name="Picture 4"/>
-            <wp:cNvGraphicFramePr>
-              <a:graphicFrameLocks xmlns:a="http://schemas.openxmlformats.org/drawingml/2006/main" noChangeAspect="1"/>
-            </wp:cNvGraphicFramePr>
-            <a:graphic xmlns:a="http://schemas.openxmlformats.org/drawingml/2006/main">
-              <a:graphicData uri="http://schemas.openxmlformats.org/drawingml/2006/picture">
-                <pic:pic xmlns:pic="http://schemas.openxmlformats.org/drawingml/2006/picture">
-                  <pic:nvPicPr>
-                    <pic:cNvPr id="4" name="Picture 4"/>
-                    <pic:cNvPicPr>
-                      <a:picLocks noChangeAspect="1"/>
-                    </pic:cNvPicPr>
-                  </pic:nvPicPr>
-                  <pic:blipFill>
-                    <a:blip r:embed="rId8"/>
-                    <a:stretch>
-                      <a:fillRect/>
-                    </a:stretch>
-                  </pic:blipFill>
-                  <pic:spPr>
-                    <a:xfrm>
-                      <a:off x="0" y="0"/>
-                      <a:ext cx="5273675" cy="3293745"/>
+                      <a:ext cx="5269230" cy="3140710"/>
                     </a:xfrm>
                     <a:prstGeom prst="rect">
                       <a:avLst/>
@@ -539,119 +263,17 @@
         </w:drawing>
       </w:r>
     </w:p>
-    <w:p/>
-    <w:p/>
-    <w:p/>
-    <w:p/>
-    <w:p>
-      <w:pPr>
-        <w:spacing w:before="140" w:after="40"/>
-      </w:pPr>
-      <w:r>
-        <w:rPr>
-          <w:b/>
-          <w:bCs/>
-          <w:sz w:val="22"/>
-          <w:szCs w:val="22"/>
-        </w:rPr>
-        <w:t>Q4. Executing a Test Suite &amp; Generating a Report (30 Marks)</w:t>
-      </w:r>
-    </w:p>
-    <w:p>
-      <w:pPr>
-        <w:spacing w:after="80"/>
-      </w:pPr>
-      <w:r>
-        <w:rPr>
-          <w:sz w:val="21"/>
-          <w:szCs w:val="21"/>
-        </w:rPr>
-        <w:t>Write a suite of at least 3 test cases covering different functionalities (e.g., login, navigation, form validation), run the suite, and generate a basic HTML/JUnit report. Add the suite as a stage in your Jenkins pipeline.</w:t>
-      </w:r>
-    </w:p>
-    <w:p>
-      <w:pPr>
-        <w:spacing w:after="20"/>
-      </w:pPr>
-      <w:r>
-        <w:rPr>
-          <w:sz w:val="21"/>
-          <w:szCs w:val="21"/>
-        </w:rPr>
-        <w:t>Screenshots/files required:</w:t>
-      </w:r>
-    </w:p>
-    <w:p>
-      <w:pPr>
-        <w:spacing w:after="20"/>
-        <w:ind w:left="360" w:hanging="220"/>
-      </w:pPr>
-      <w:r>
-        <w:rPr>
-          <w:sz w:val="21"/>
-          <w:szCs w:val="21"/>
-        </w:rPr>
-        <w:t>• Test suite code covering at least 3 test cases — 10 marks</w:t>
-      </w:r>
-    </w:p>
-    <w:p>
-      <w:pPr>
-        <w:spacing w:after="20"/>
-        <w:ind w:left="360" w:hanging="220"/>
-      </w:pPr>
-      <w:r>
-        <w:rPr>
-          <w:sz w:val="21"/>
-          <w:szCs w:val="21"/>
-        </w:rPr>
-        <w:t>• Console/runner output showing all test cases executing — 8 marks</w:t>
-      </w:r>
-    </w:p>
-    <w:p>
-      <w:pPr>
-        <w:spacing w:after="20"/>
-        <w:ind w:left="360" w:hanging="220"/>
-      </w:pPr>
-      <w:r>
-        <w:rPr>
-          <w:sz w:val="21"/>
-          <w:szCs w:val="21"/>
-        </w:rPr>
-        <w:t>• Generated HTML/JUnit report showing pass/fail results — 8 marks</w:t>
-      </w:r>
-    </w:p>
-    <w:p>
-      <w:pPr>
-        <w:spacing w:after="20"/>
-        <w:ind w:left="360" w:hanging="220"/>
-        <w:rPr>
-          <w:sz w:val="21"/>
-          <w:szCs w:val="21"/>
-        </w:rPr>
-      </w:pPr>
-      <w:r>
-        <w:rPr>
-          <w:sz w:val="21"/>
-          <w:szCs w:val="21"/>
-        </w:rPr>
-        <w:t>• Jenkins pipeline stage showing the suite added as a build step — 4 marks</w:t>
-      </w:r>
-    </w:p>
-    <w:p>
-      <w:pPr>
-        <w:spacing w:after="20"/>
-        <w:ind w:left="360" w:hanging="220"/>
-        <w:rPr>
-          <w:sz w:val="21"/>
-          <w:szCs w:val="21"/>
-        </w:rPr>
+    <w:p>
+      <w:pPr>
+        <w:spacing w:after="20"/>
+        <w:ind w:left="360" w:hanging="220"/>
       </w:pPr>
       <w:r>
         <w:drawing>
           <wp:inline distT="0" distB="0" distL="114300" distR="114300">
-            <wp:extent cx="5266690" cy="3291840"/>
-            <wp:effectExtent l="0" t="0" r="3810" b="10160"/>
-            <wp:docPr id="8" name="Picture 6"/>
+            <wp:extent cx="5269865" cy="4148455"/>
+            <wp:effectExtent l="0" t="0" r="635" b="4445"/>
+            <wp:docPr id="12" name="Picture 6"/>
             <wp:cNvGraphicFramePr>
               <a:graphicFrameLocks xmlns:a="http://schemas.openxmlformats.org/drawingml/2006/main" noChangeAspect="1"/>
             </wp:cNvGraphicFramePr>
@@ -659,7 +281,188 @@
               <a:graphicData uri="http://schemas.openxmlformats.org/drawingml/2006/picture">
                 <pic:pic xmlns:pic="http://schemas.openxmlformats.org/drawingml/2006/picture">
                   <pic:nvPicPr>
-                    <pic:cNvPr id="8" name="Picture 6"/>
+                    <pic:cNvPr id="12" name="Picture 6"/>
+                    <pic:cNvPicPr>
+                      <a:picLocks noChangeAspect="1"/>
+                    </pic:cNvPicPr>
+                  </pic:nvPicPr>
+                  <pic:blipFill>
+                    <a:blip r:embed="rId7"/>
+                    <a:stretch>
+                      <a:fillRect/>
+                    </a:stretch>
+                  </pic:blipFill>
+                  <pic:spPr>
+                    <a:xfrm>
+                      <a:off x="0" y="0"/>
+                      <a:ext cx="5269865" cy="4148455"/>
+                    </a:xfrm>
+                    <a:prstGeom prst="rect">
+                      <a:avLst/>
+                    </a:prstGeom>
+                    <a:noFill/>
+                    <a:ln>
+                      <a:noFill/>
+                    </a:ln>
+                  </pic:spPr>
+                </pic:pic>
+              </a:graphicData>
+            </a:graphic>
+          </wp:inline>
+        </w:drawing>
+      </w:r>
+    </w:p>
+    <w:p>
+      <w:pPr>
+        <w:spacing w:before="140" w:after="40"/>
+      </w:pPr>
+      <w:r>
+        <w:rPr>
+          <w:b/>
+          <w:bCs/>
+          <w:sz w:val="22"/>
+          <w:szCs w:val="22"/>
+        </w:rPr>
+        <w:t>Q2. Docker Image Build &amp; Push via Jenkins (20 Marks)</w:t>
+      </w:r>
+    </w:p>
+    <w:p>
+      <w:pPr>
+        <w:spacing w:after="80"/>
+      </w:pPr>
+      <w:r>
+        <w:rPr>
+          <w:sz w:val="21"/>
+          <w:szCs w:val="21"/>
+        </w:rPr>
+        <w:t>Write a Dockerfile for the given application, trigger your Jenkins pipeline to build the image, push it to the registry with a tag, and run the container.</w:t>
+      </w:r>
+    </w:p>
+    <w:p>
+      <w:pPr>
+        <w:spacing w:after="20"/>
+      </w:pPr>
+      <w:r>
+        <w:rPr>
+          <w:sz w:val="21"/>
+          <w:szCs w:val="21"/>
+        </w:rPr>
+        <w:t>Screenshots/files required:</w:t>
+      </w:r>
+    </w:p>
+    <w:p>
+      <w:pPr>
+        <w:spacing w:after="20"/>
+        <w:ind w:left="360" w:hanging="220"/>
+      </w:pPr>
+      <w:r>
+        <w:rPr>
+          <w:sz w:val="21"/>
+          <w:szCs w:val="21"/>
+        </w:rPr>
+        <w:t>• Dockerfile used for the application — 5 marks</w:t>
+      </w:r>
+    </w:p>
+    <w:p>
+      <w:pPr>
+        <w:spacing w:after="20"/>
+        <w:ind w:left="360" w:hanging="220"/>
+      </w:pPr>
+      <w:r>
+        <w:rPr>
+          <w:sz w:val="21"/>
+          <w:szCs w:val="21"/>
+        </w:rPr>
+        <w:t>• Jenkins console output showing the image built successfully — 6 marks</w:t>
+      </w:r>
+    </w:p>
+    <w:p>
+      <w:pPr>
+        <w:spacing w:after="20"/>
+        <w:ind w:left="360" w:hanging="220"/>
+      </w:pPr>
+      <w:r>
+        <w:rPr>
+          <w:sz w:val="21"/>
+          <w:szCs w:val="21"/>
+        </w:rPr>
+        <w:t>• Registry push confirmation showing the image tag — 5 marks</w:t>
+      </w:r>
+    </w:p>
+    <w:p>
+      <w:pPr>
+        <w:spacing w:after="20"/>
+        <w:ind w:left="360" w:hanging="220"/>
+      </w:pPr>
+      <w:r>
+        <w:rPr>
+          <w:sz w:val="21"/>
+          <w:szCs w:val="21"/>
+        </w:rPr>
+        <w:t>• Container run output / browser screenshot confirming the application is accessible — 4 marks</w:t>
+      </w:r>
+    </w:p>
+    <w:p/>
+    <w:p>
+      <w:r>
+        <w:drawing>
+          <wp:inline distT="0" distB="0" distL="114300" distR="114300">
+            <wp:extent cx="5273675" cy="3162300"/>
+            <wp:effectExtent l="0" t="0" r="9525" b="0"/>
+            <wp:docPr id="10" name="Picture 4"/>
+            <wp:cNvGraphicFramePr>
+              <a:graphicFrameLocks xmlns:a="http://schemas.openxmlformats.org/drawingml/2006/main" noChangeAspect="1"/>
+            </wp:cNvGraphicFramePr>
+            <a:graphic xmlns:a="http://schemas.openxmlformats.org/drawingml/2006/main">
+              <a:graphicData uri="http://schemas.openxmlformats.org/drawingml/2006/picture">
+                <pic:pic xmlns:pic="http://schemas.openxmlformats.org/drawingml/2006/picture">
+                  <pic:nvPicPr>
+                    <pic:cNvPr id="10" name="Picture 4"/>
+                    <pic:cNvPicPr>
+                      <a:picLocks noChangeAspect="1"/>
+                    </pic:cNvPicPr>
+                  </pic:nvPicPr>
+                  <pic:blipFill>
+                    <a:blip r:embed="rId8"/>
+                    <a:stretch>
+                      <a:fillRect/>
+                    </a:stretch>
+                  </pic:blipFill>
+                  <pic:spPr>
+                    <a:xfrm>
+                      <a:off x="0" y="0"/>
+                      <a:ext cx="5273675" cy="3162300"/>
+                    </a:xfrm>
+                    <a:prstGeom prst="rect">
+                      <a:avLst/>
+                    </a:prstGeom>
+                    <a:noFill/>
+                    <a:ln>
+                      <a:noFill/>
+                    </a:ln>
+                  </pic:spPr>
+                </pic:pic>
+              </a:graphicData>
+            </a:graphic>
+          </wp:inline>
+        </w:drawing>
+      </w:r>
+    </w:p>
+    <w:p>
+      <w:r>
+        <w:drawing>
+          <wp:inline distT="0" distB="0" distL="114300" distR="114300">
+            <wp:extent cx="5266690" cy="3291840"/>
+            <wp:effectExtent l="0" t="0" r="3810" b="10160"/>
+            <wp:docPr id="13" name="Picture 7"/>
+            <wp:cNvGraphicFramePr>
+              <a:graphicFrameLocks xmlns:a="http://schemas.openxmlformats.org/drawingml/2006/main" noChangeAspect="1"/>
+            </wp:cNvGraphicFramePr>
+            <a:graphic xmlns:a="http://schemas.openxmlformats.org/drawingml/2006/main">
+              <a:graphicData uri="http://schemas.openxmlformats.org/drawingml/2006/picture">
+                <pic:pic xmlns:pic="http://schemas.openxmlformats.org/drawingml/2006/picture">
+                  <pic:nvPicPr>
+                    <pic:cNvPr id="13" name="Picture 7"/>
                     <pic:cNvPicPr>
                       <a:picLocks noChangeAspect="1"/>
                     </pic:cNvPicPr>
@@ -690,6 +493,397 @@
         </w:drawing>
       </w:r>
     </w:p>
+    <w:p/>
+    <w:p>
+      <w:pPr>
+        <w:spacing w:before="140" w:after="40"/>
+      </w:pPr>
+      <w:r>
+        <w:rPr>
+          <w:b/>
+          <w:bCs/>
+          <w:sz w:val="22"/>
+          <w:szCs w:val="22"/>
+        </w:rPr>
+        <w:t>Q3. Selenium WebDriver Script — Basic Functional Testing (30 Marks)</w:t>
+      </w:r>
+    </w:p>
+    <w:p>
+      <w:pPr>
+        <w:spacing w:after="80"/>
+      </w:pPr>
+      <w:r>
+        <w:rPr>
+          <w:sz w:val="21"/>
+          <w:szCs w:val="21"/>
+        </w:rPr>
+        <w:t>Write a Selenium script that opens a given website, verifies the page title, and performs one form interaction (e.g., entering a search term and submitting).</w:t>
+      </w:r>
+    </w:p>
+    <w:p>
+      <w:pPr>
+        <w:spacing w:after="20"/>
+      </w:pPr>
+      <w:r>
+        <w:rPr>
+          <w:sz w:val="21"/>
+          <w:szCs w:val="21"/>
+        </w:rPr>
+        <w:t>Screenshots/files required:</w:t>
+      </w:r>
+    </w:p>
+    <w:p>
+      <w:pPr>
+        <w:spacing w:after="20"/>
+        <w:ind w:left="360" w:hanging="220"/>
+      </w:pPr>
+      <w:r>
+        <w:rPr>
+          <w:sz w:val="21"/>
+          <w:szCs w:val="21"/>
+        </w:rPr>
+        <w:t>• Full script code — 6 marks</w:t>
+      </w:r>
+    </w:p>
+    <w:p>
+      <w:pPr>
+        <w:spacing w:after="20"/>
+        <w:ind w:left="360" w:hanging="220"/>
+      </w:pPr>
+      <w:r>
+        <w:rPr>
+          <w:sz w:val="21"/>
+          <w:szCs w:val="21"/>
+        </w:rPr>
+        <w:t>• Terminal/IDE output showing the script executed successfully — 6 marks</w:t>
+      </w:r>
+    </w:p>
+    <w:p>
+      <w:pPr>
+        <w:spacing w:after="20"/>
+        <w:ind w:left="360" w:hanging="220"/>
+      </w:pPr>
+      <w:r>
+        <w:rPr>
+          <w:sz w:val="21"/>
+          <w:szCs w:val="21"/>
+        </w:rPr>
+        <w:t>• Assertion/log confirming the page title or URL matches the expected value — 8 marks</w:t>
+      </w:r>
+    </w:p>
+    <w:p>
+      <w:pPr>
+        <w:spacing w:after="20"/>
+        <w:ind w:left="360" w:hanging="220"/>
+      </w:pPr>
+      <w:r>
+        <w:rPr>
+          <w:sz w:val="21"/>
+          <w:szCs w:val="21"/>
+        </w:rPr>
+        <w:t>• Browser screenshot showing the result of the form interaction (e.g., search results page) — 10 marks</w:t>
+      </w:r>
+    </w:p>
+    <w:p>
+      <w:pPr>
+        <w:rPr>
+          <w:rFonts w:hint="default"/>
+          <w:lang w:val="en-US"/>
+        </w:rPr>
+      </w:pPr>
+      <w:r>
+        <w:rPr>
+          <w:rFonts w:hint="default"/>
+          <w:lang w:val="en-US"/>
+        </w:rPr>
+        <w:drawing>
+          <wp:inline distT="0" distB="0" distL="114300" distR="114300">
+            <wp:extent cx="5266690" cy="3291840"/>
+            <wp:effectExtent l="0" t="0" r="3810" b="10160"/>
+            <wp:docPr id="5" name="Picture 5" descr="Screenshot 2026-09-11 113624"/>
+            <wp:cNvGraphicFramePr>
+              <a:graphicFrameLocks xmlns:a="http://schemas.openxmlformats.org/drawingml/2006/main" noChangeAspect="1"/>
+            </wp:cNvGraphicFramePr>
+            <a:graphic xmlns:a="http://schemas.openxmlformats.org/drawingml/2006/main">
+              <a:graphicData uri="http://schemas.openxmlformats.org/drawingml/2006/picture">
+                <pic:pic xmlns:pic="http://schemas.openxmlformats.org/drawingml/2006/picture">
+                  <pic:nvPicPr>
+                    <pic:cNvPr id="5" name="Picture 5" descr="Screenshot 2026-09-11 113624"/>
+                    <pic:cNvPicPr>
+                      <a:picLocks noChangeAspect="1"/>
+                    </pic:cNvPicPr>
+                  </pic:nvPicPr>
+                  <pic:blipFill>
+                    <a:blip r:embed="rId10"/>
+                    <a:stretch>
+                      <a:fillRect/>
+                    </a:stretch>
+                  </pic:blipFill>
+                  <pic:spPr>
+                    <a:xfrm>
+                      <a:off x="0" y="0"/>
+                      <a:ext cx="5266690" cy="3291840"/>
+                    </a:xfrm>
+                    <a:prstGeom prst="rect">
+                      <a:avLst/>
+                    </a:prstGeom>
+                  </pic:spPr>
+                </pic:pic>
+              </a:graphicData>
+            </a:graphic>
+          </wp:inline>
+        </w:drawing>
+      </w:r>
+    </w:p>
+    <w:p>
+      <w:pPr>
+        <w:rPr>
+          <w:rFonts w:hint="default"/>
+          <w:lang w:val="en-US"/>
+        </w:rPr>
+      </w:pPr>
+      <w:r>
+        <w:rPr>
+          <w:rFonts w:hint="default"/>
+          <w:lang w:val="en-US"/>
+        </w:rPr>
+        <w:drawing>
+          <wp:inline distT="0" distB="0" distL="114300" distR="114300">
+            <wp:extent cx="5266690" cy="3291840"/>
+            <wp:effectExtent l="0" t="0" r="3810" b="10160"/>
+            <wp:docPr id="6" name="Picture 6" descr="Screenshot 2026-09-11 113633"/>
+            <wp:cNvGraphicFramePr>
+              <a:graphicFrameLocks xmlns:a="http://schemas.openxmlformats.org/drawingml/2006/main" noChangeAspect="1"/>
+            </wp:cNvGraphicFramePr>
+            <a:graphic xmlns:a="http://schemas.openxmlformats.org/drawingml/2006/main">
+              <a:graphicData uri="http://schemas.openxmlformats.org/drawingml/2006/picture">
+                <pic:pic xmlns:pic="http://schemas.openxmlformats.org/drawingml/2006/picture">
+                  <pic:nvPicPr>
+                    <pic:cNvPr id="6" name="Picture 6" descr="Screenshot 2026-09-11 113633"/>
+                    <pic:cNvPicPr>
+                      <a:picLocks noChangeAspect="1"/>
+                    </pic:cNvPicPr>
+                  </pic:nvPicPr>
+                  <pic:blipFill>
+                    <a:blip r:embed="rId11"/>
+                    <a:stretch>
+                      <a:fillRect/>
+                    </a:stretch>
+                  </pic:blipFill>
+                  <pic:spPr>
+                    <a:xfrm>
+                      <a:off x="0" y="0"/>
+                      <a:ext cx="5266690" cy="3291840"/>
+                    </a:xfrm>
+                    <a:prstGeom prst="rect">
+                      <a:avLst/>
+                    </a:prstGeom>
+                  </pic:spPr>
+                </pic:pic>
+              </a:graphicData>
+            </a:graphic>
+          </wp:inline>
+        </w:drawing>
+      </w:r>
+    </w:p>
+    <w:p>
+      <w:r>
+        <w:drawing>
+          <wp:inline distT="0" distB="0" distL="114300" distR="114300">
+            <wp:extent cx="5273675" cy="3293745"/>
+            <wp:effectExtent l="0" t="0" r="9525" b="8255"/>
+            <wp:docPr id="4" name="Picture 4"/>
+            <wp:cNvGraphicFramePr>
+              <a:graphicFrameLocks xmlns:a="http://schemas.openxmlformats.org/drawingml/2006/main" noChangeAspect="1"/>
+            </wp:cNvGraphicFramePr>
+            <a:graphic xmlns:a="http://schemas.openxmlformats.org/drawingml/2006/main">
+              <a:graphicData uri="http://schemas.openxmlformats.org/drawingml/2006/picture">
+                <pic:pic xmlns:pic="http://schemas.openxmlformats.org/drawingml/2006/picture">
+                  <pic:nvPicPr>
+                    <pic:cNvPr id="4" name="Picture 4"/>
+                    <pic:cNvPicPr>
+                      <a:picLocks noChangeAspect="1"/>
+                    </pic:cNvPicPr>
+                  </pic:nvPicPr>
+                  <pic:blipFill>
+                    <a:blip r:embed="rId12"/>
+                    <a:stretch>
+                      <a:fillRect/>
+                    </a:stretch>
+                  </pic:blipFill>
+                  <pic:spPr>
+                    <a:xfrm>
+                      <a:off x="0" y="0"/>
+                      <a:ext cx="5273675" cy="3293745"/>
+                    </a:xfrm>
+                    <a:prstGeom prst="rect">
+                      <a:avLst/>
+                    </a:prstGeom>
+                    <a:noFill/>
+                    <a:ln>
+                      <a:noFill/>
+                    </a:ln>
+                  </pic:spPr>
+                </pic:pic>
+              </a:graphicData>
+            </a:graphic>
+          </wp:inline>
+        </w:drawing>
+      </w:r>
+      <w:bookmarkStart w:id="0" w:name="_GoBack"/>
+      <w:bookmarkEnd w:id="0"/>
+    </w:p>
+    <w:p/>
+    <w:p/>
+    <w:p/>
+    <w:p/>
+    <w:p>
+      <w:pPr>
+        <w:spacing w:before="140" w:after="40"/>
+      </w:pPr>
+      <w:r>
+        <w:rPr>
+          <w:b/>
+          <w:bCs/>
+          <w:sz w:val="22"/>
+          <w:szCs w:val="22"/>
+        </w:rPr>
+        <w:t>Q4. Executing a Test Suite &amp; Generating a Report (30 Marks)</w:t>
+      </w:r>
+    </w:p>
+    <w:p>
+      <w:pPr>
+        <w:spacing w:after="80"/>
+      </w:pPr>
+      <w:r>
+        <w:rPr>
+          <w:sz w:val="21"/>
+          <w:szCs w:val="21"/>
+        </w:rPr>
+        <w:t>Write a suite of at least 3 test cases covering different functionalities (e.g., login, navigation, form validation), run the suite, and generate a basic HTML/JUnit report. Add the suite as a stage in your Jenkins pipeline.</w:t>
+      </w:r>
+    </w:p>
+    <w:p>
+      <w:pPr>
+        <w:spacing w:after="20"/>
+      </w:pPr>
+      <w:r>
+        <w:rPr>
+          <w:sz w:val="21"/>
+          <w:szCs w:val="21"/>
+        </w:rPr>
+        <w:t>Screenshots/files required:</w:t>
+      </w:r>
+    </w:p>
+    <w:p>
+      <w:pPr>
+        <w:spacing w:after="20"/>
+        <w:ind w:left="360" w:hanging="220"/>
+      </w:pPr>
+      <w:r>
+        <w:rPr>
+          <w:sz w:val="21"/>
+          <w:szCs w:val="21"/>
+        </w:rPr>
+        <w:t>• Test suite code covering at least 3 test cases — 10 marks</w:t>
+      </w:r>
+    </w:p>
+    <w:p>
+      <w:pPr>
+        <w:spacing w:after="20"/>
+        <w:ind w:left="360" w:hanging="220"/>
+      </w:pPr>
+      <w:r>
+        <w:rPr>
+          <w:sz w:val="21"/>
+          <w:szCs w:val="21"/>
+        </w:rPr>
+        <w:t>• Console/runner output showing all test cases executing — 8 marks</w:t>
+      </w:r>
+    </w:p>
+    <w:p>
+      <w:pPr>
+        <w:spacing w:after="20"/>
+        <w:ind w:left="360" w:hanging="220"/>
+      </w:pPr>
+      <w:r>
+        <w:rPr>
+          <w:sz w:val="21"/>
+          <w:szCs w:val="21"/>
+        </w:rPr>
+        <w:t>• Generated HTML/JUnit report showing pass/fail results — 8 marks</w:t>
+      </w:r>
+    </w:p>
+    <w:p>
+      <w:pPr>
+        <w:spacing w:after="20"/>
+        <w:ind w:left="360" w:hanging="220"/>
+        <w:rPr>
+          <w:sz w:val="21"/>
+          <w:szCs w:val="21"/>
+        </w:rPr>
+      </w:pPr>
+      <w:r>
+        <w:rPr>
+          <w:sz w:val="21"/>
+          <w:szCs w:val="21"/>
+        </w:rPr>
+        <w:t>• Jenkins pipeline stage showing the suite added as a build step — 4 marks</w:t>
+      </w:r>
+    </w:p>
+    <w:p>
+      <w:pPr>
+        <w:spacing w:after="20"/>
+        <w:ind w:left="360" w:hanging="220"/>
+        <w:rPr>
+          <w:sz w:val="21"/>
+          <w:szCs w:val="21"/>
+        </w:rPr>
+      </w:pPr>
+      <w:r>
+        <w:drawing>
+          <wp:inline distT="0" distB="0" distL="114300" distR="114300">
+            <wp:extent cx="5266690" cy="3291840"/>
+            <wp:effectExtent l="0" t="0" r="3810" b="10160"/>
+            <wp:docPr id="8" name="Picture 6"/>
+            <wp:cNvGraphicFramePr>
+              <a:graphicFrameLocks xmlns:a="http://schemas.openxmlformats.org/drawingml/2006/main" noChangeAspect="1"/>
+            </wp:cNvGraphicFramePr>
+            <a:graphic xmlns:a="http://schemas.openxmlformats.org/drawingml/2006/main">
+              <a:graphicData uri="http://schemas.openxmlformats.org/drawingml/2006/picture">
+                <pic:pic xmlns:pic="http://schemas.openxmlformats.org/drawingml/2006/picture">
+                  <pic:nvPicPr>
+                    <pic:cNvPr id="8" name="Picture 6"/>
+                    <pic:cNvPicPr>
+                      <a:picLocks noChangeAspect="1"/>
+                    </pic:cNvPicPr>
+                  </pic:nvPicPr>
+                  <pic:blipFill>
+                    <a:blip r:embed="rId13"/>
+                    <a:stretch>
+                      <a:fillRect/>
+                    </a:stretch>
+                  </pic:blipFill>
+                  <pic:spPr>
+                    <a:xfrm>
+                      <a:off x="0" y="0"/>
+                      <a:ext cx="5266690" cy="3291840"/>
+                    </a:xfrm>
+                    <a:prstGeom prst="rect">
+                      <a:avLst/>
+                    </a:prstGeom>
+                    <a:noFill/>
+                    <a:ln>
+                      <a:noFill/>
+                    </a:ln>
+                  </pic:spPr>
+                </pic:pic>
+              </a:graphicData>
+            </a:graphic>
+          </wp:inline>
+        </w:drawing>
+      </w:r>
+    </w:p>
     <w:p>
       <w:r>
         <w:drawing>
@@ -710,7 +904,7 @@
                     </pic:cNvPicPr>
                   </pic:nvPicPr>
                   <pic:blipFill>
-                    <a:blip r:embed="rId10"/>
+                    <a:blip r:embed="rId14"/>
                     <a:stretch>
                       <a:fillRect/>
                     </a:stretch>

</xml_diff>